<commit_message>
Project Update #2 final submission
</commit_message>
<xml_diff>
--- a/project_updates/Adis_Delanovic_Project_2.docx
+++ b/project_updates/Adis_Delanovic_Project_2.docx
@@ -666,7 +666,7 @@
         <w:rPr>
           <w:iCs/>
         </w:rPr>
-        <w:t xml:space="preserve"> I just really wanted to do this part as an addition. </w:t>
+        <w:t xml:space="preserve"> </w:t>
       </w:r>
     </w:p>
     <w:p>
@@ -697,7 +697,19 @@
         <w:rPr>
           <w:iCs/>
         </w:rPr>
-        <w:t xml:space="preserve">issue where Streamlit app was crashing due to a caching issue that was exceeding the websites 1GB free tier allotment. </w:t>
+        <w:t>issue where Streamlit app was crashing due to a caching issue that was exceeding the website</w:t>
+      </w:r>
+      <w:r>
+        <w:rPr>
+          <w:iCs/>
+        </w:rPr>
+        <w:t>’</w:t>
+      </w:r>
+      <w:r>
+        <w:rPr>
+          <w:iCs/>
+        </w:rPr>
+        <w:t xml:space="preserve">s 1GB free tier allotment. </w:t>
       </w:r>
     </w:p>
     <w:p>
@@ -913,25 +925,6 @@
       <w:pPr>
         <w:pStyle w:val="ListBullet"/>
         <w:numPr>
-          <w:ilvl w:val="1"/>
-          <w:numId w:val="7"/>
-        </w:numPr>
-        <w:rPr>
-          <w:b/>
-          <w:bCs/>
-        </w:rPr>
-      </w:pPr>
-      <w:r>
-        <w:rPr>
-          <w:iCs/>
-        </w:rPr>
-        <w:t>Everything is organized and easy to follow</w:t>
-      </w:r>
-    </w:p>
-    <w:p>
-      <w:pPr>
-        <w:pStyle w:val="ListBullet"/>
-        <w:numPr>
           <w:ilvl w:val="0"/>
           <w:numId w:val="7"/>
         </w:numPr>
@@ -960,7 +953,25 @@
         </w:rPr>
       </w:pPr>
       <w:r>
-        <w:t>Learned about mutate(), saveRDS/loadRDS, twimws(), saving and loading CSV data,</w:t>
+        <w:t xml:space="preserve">Learned about mutate(), </w:t>
+      </w:r>
+      <w:r>
+        <w:t>read</w:t>
+      </w:r>
+      <w:r>
+        <w:t>RDS/</w:t>
+      </w:r>
+      <w:r>
+        <w:t>save</w:t>
+      </w:r>
+      <w:r>
+        <w:t>RDS, t</w:t>
+      </w:r>
+      <w:r>
+        <w:t>r</w:t>
+      </w:r>
+      <w:r>
+        <w:t>imws(), saving and loading CSV data,</w:t>
       </w:r>
       <w:r>
         <w:rPr>
@@ -970,7 +981,13 @@
         <w:t xml:space="preserve"> </w:t>
       </w:r>
       <w:r>
-        <w:t>creating plots, binning/ordering</w:t>
+        <w:t>creating plots</w:t>
+      </w:r>
+      <w:r>
+        <w:t xml:space="preserve"> and saving them</w:t>
+      </w:r>
+      <w:r>
+        <w:t>, binning/ordering</w:t>
       </w:r>
       <w:r>
         <w:t>/factoring</w:t>
@@ -1068,12 +1085,18 @@
     </w:p>
     <w:p>
       <w:pPr>
+        <w:pStyle w:val="ListBullet"/>
+        <w:keepNext/>
+        <w:numPr>
+          <w:ilvl w:val="0"/>
+          <w:numId w:val="0"/>
+        </w:numPr>
+      </w:pPr>
+    </w:p>
+    <w:p>
+      <w:pPr>
         <w:pStyle w:val="Caption"/>
         <w:jc w:val="center"/>
-        <w:rPr>
-          <w:b/>
-          <w:bCs/>
-        </w:rPr>
       </w:pPr>
       <w:bookmarkStart w:id="0" w:name="_Ref239233375"/>
       <w:r>
@@ -1102,6 +1125,30 @@
         <w:t xml:space="preserve"> - Wildlife Strikes by Season</w:t>
       </w:r>
     </w:p>
+    <w:p>
+      <w:pPr>
+        <w:pStyle w:val="ListBullet"/>
+        <w:keepNext/>
+        <w:numPr>
+          <w:ilvl w:val="0"/>
+          <w:numId w:val="0"/>
+        </w:numPr>
+        <w:ind w:left="720"/>
+      </w:pPr>
+      <w:r>
+        <w:t>Figure 1 shows that migration seasons correspond with increased wildlife strikes. Reported strikes in summer and fall are nearly double those in winter and spring, rising through the spring migration period (March–June) to a peak during fall migration (August–October)</w:t>
+      </w:r>
+      <w:r>
+        <w:rPr>
+          <w:rStyle w:val="EndnoteReference"/>
+        </w:rPr>
+        <w:endnoteReference w:id="2"/>
+      </w:r>
+      <w:r>
+        <w:t xml:space="preserve">. </w:t>
+      </w:r>
+    </w:p>
+    <w:p/>
     <w:p>
       <w:pPr>
         <w:pStyle w:val="ListBullet"/>
@@ -1116,6 +1163,7 @@
         <w:rPr>
           <w:noProof/>
         </w:rPr>
+        <w:lastRenderedPageBreak/>
         <w:drawing>
           <wp:inline distT="0" distB="0" distL="0" distR="0" wp14:anchorId="622D0C5B" wp14:editId="512B3D0A">
             <wp:extent cx="6309360" cy="3785870"/>
@@ -1168,12 +1216,19 @@
     </w:p>
     <w:p>
       <w:pPr>
+        <w:pStyle w:val="ListBullet"/>
+        <w:keepNext/>
+        <w:numPr>
+          <w:ilvl w:val="0"/>
+          <w:numId w:val="0"/>
+        </w:numPr>
+        <w:ind w:left="720" w:hanging="360"/>
+      </w:pPr>
+    </w:p>
+    <w:p>
+      <w:pPr>
         <w:pStyle w:val="Caption"/>
         <w:jc w:val="center"/>
-        <w:rPr>
-          <w:b/>
-          <w:bCs/>
-        </w:rPr>
       </w:pPr>
       <w:bookmarkStart w:id="1" w:name="_Ref239233378"/>
       <w:r>
@@ -1202,21 +1257,61 @@
         <w:t xml:space="preserve"> - Wildlife Strikes by Time of Day</w:t>
       </w:r>
     </w:p>
+    <w:p/>
     <w:p>
       <w:pPr>
         <w:pStyle w:val="Heading2"/>
-      </w:pPr>
-    </w:p>
-    <w:p>
-      <w:pPr>
-        <w:pStyle w:val="Heading2"/>
-      </w:pPr>
-    </w:p>
-    <w:p>
-      <w:pPr>
-        <w:pStyle w:val="Heading2"/>
-      </w:pPr>
-    </w:p>
+        <w:rPr>
+          <w:rFonts w:asciiTheme="minorHAnsi" w:hAnsiTheme="minorHAnsi"/>
+          <w:b w:val="0"/>
+          <w:bCs w:val="0"/>
+          <w:noProof w:val="0"/>
+          <w:szCs w:val="22"/>
+        </w:rPr>
+      </w:pPr>
+      <w:r>
+        <w:rPr>
+          <w:rFonts w:asciiTheme="minorHAnsi" w:hAnsiTheme="minorHAnsi"/>
+          <w:b w:val="0"/>
+          <w:bCs w:val="0"/>
+          <w:noProof w:val="0"/>
+          <w:szCs w:val="22"/>
+        </w:rPr>
+        <w:t>Figure 2 shows how strikes in each time-of-day category are distributed across the calendar year. TIME_OF_DAY is missing for 44% of records (153k of ~350k), so percentages are calculated over the ~197k strikes with a recorded time</w:t>
+      </w:r>
+      <w:r>
+        <w:rPr>
+          <w:rFonts w:asciiTheme="minorHAnsi" w:hAnsiTheme="minorHAnsi"/>
+          <w:b w:val="0"/>
+          <w:bCs w:val="0"/>
+          <w:noProof w:val="0"/>
+          <w:szCs w:val="22"/>
+        </w:rPr>
+        <w:t xml:space="preserve"> of day</w:t>
+      </w:r>
+      <w:r>
+        <w:rPr>
+          <w:rFonts w:asciiTheme="minorHAnsi" w:hAnsiTheme="minorHAnsi"/>
+          <w:b w:val="0"/>
+          <w:bCs w:val="0"/>
+          <w:noProof w:val="0"/>
+          <w:szCs w:val="22"/>
+        </w:rPr>
+        <w:t>; each category's twelve-monthly values sum to 100%. Night strikes are the most seasonally concentrated: June accounts for just 2.5% of them, rising to roughly 20% in October, consistent with nocturnal fall migration. Because reporting is voluntary and completeness varies, these figures describe recorded strikes rather than all strikes.</w:t>
+      </w:r>
+      <w:r>
+        <w:rPr>
+          <w:rStyle w:val="EndnoteReference"/>
+          <w:rFonts w:asciiTheme="minorHAnsi" w:hAnsiTheme="minorHAnsi"/>
+          <w:b w:val="0"/>
+          <w:bCs w:val="0"/>
+          <w:noProof w:val="0"/>
+          <w:szCs w:val="22"/>
+        </w:rPr>
+        <w:endnoteReference w:id="3"/>
+      </w:r>
+    </w:p>
+    <w:p/>
     <w:p>
       <w:pPr>
         <w:pStyle w:val="Heading2"/>
@@ -1312,6 +1407,30 @@
         </w:rPr>
         <w:t xml:space="preserve">There are a lot of missing values. This is all due to no required reporting/everything is voluntary. </w:t>
       </w:r>
+      <w:r>
+        <w:rPr>
+          <w:rStyle w:val="Emphasis"/>
+          <w:b w:val="0"/>
+          <w:iCs w:val="0"/>
+        </w:rPr>
+        <w:t xml:space="preserve">We have a total of 350k~ observations. </w:t>
+      </w:r>
+      <w:r>
+        <w:rPr>
+          <w:rStyle w:val="Emphasis"/>
+          <w:b w:val="0"/>
+          <w:iCs w:val="0"/>
+        </w:rPr>
+        <w:t>These</w:t>
+      </w:r>
+      <w:r>
+        <w:rPr>
+          <w:rStyle w:val="Emphasis"/>
+          <w:b w:val="0"/>
+          <w:iCs w:val="0"/>
+        </w:rPr>
+        <w:t xml:space="preserve"> are the ones with the most significant NA values that will impact my initially stated business questions.</w:t>
+      </w:r>
     </w:p>
     <w:p>
       <w:pPr>
@@ -1332,7 +1451,8 @@
           <w:b w:val="0"/>
           <w:iCs w:val="0"/>
         </w:rPr>
-        <w:t>TIME_OF_DAY: 153k missing</w:t>
+        <w:lastRenderedPageBreak/>
+        <w:t>FAAREGION: ~47,000/350,000 missing but AIRPORT_ID has 0 missing.</w:t>
       </w:r>
     </w:p>
     <w:p>
@@ -1354,7 +1474,85 @@
           <w:b w:val="0"/>
           <w:iCs w:val="0"/>
         </w:rPr>
-        <w:t>FAAREGION: 47k missing but AIRPORT_ID has 0 missing.</w:t>
+        <w:t xml:space="preserve">TIME_OF_DAY: </w:t>
+      </w:r>
+      <w:r>
+        <w:rPr>
+          <w:rStyle w:val="Emphasis"/>
+          <w:b w:val="0"/>
+          <w:iCs w:val="0"/>
+        </w:rPr>
+        <w:t>~</w:t>
+      </w:r>
+      <w:r>
+        <w:rPr>
+          <w:rStyle w:val="Emphasis"/>
+          <w:b w:val="0"/>
+          <w:iCs w:val="0"/>
+        </w:rPr>
+        <w:t>153</w:t>
+      </w:r>
+      <w:r>
+        <w:rPr>
+          <w:rStyle w:val="Emphasis"/>
+          <w:b w:val="0"/>
+          <w:iCs w:val="0"/>
+        </w:rPr>
+        <w:t>,000</w:t>
+      </w:r>
+      <w:r>
+        <w:rPr>
+          <w:rStyle w:val="Emphasis"/>
+          <w:b w:val="0"/>
+          <w:iCs w:val="0"/>
+        </w:rPr>
+        <w:t>/350</w:t>
+      </w:r>
+      <w:r>
+        <w:rPr>
+          <w:rStyle w:val="Emphasis"/>
+          <w:b w:val="0"/>
+          <w:iCs w:val="0"/>
+        </w:rPr>
+        <w:t>,000</w:t>
+      </w:r>
+      <w:r>
+        <w:rPr>
+          <w:rStyle w:val="Emphasis"/>
+          <w:b w:val="0"/>
+          <w:iCs w:val="0"/>
+        </w:rPr>
+        <w:t xml:space="preserve"> missing</w:t>
+      </w:r>
+    </w:p>
+    <w:p>
+      <w:pPr>
+        <w:pStyle w:val="ListBullet"/>
+        <w:numPr>
+          <w:ilvl w:val="2"/>
+          <w:numId w:val="8"/>
+        </w:numPr>
+        <w:rPr>
+          <w:rStyle w:val="Emphasis"/>
+          <w:b w:val="0"/>
+          <w:iCs w:val="0"/>
+        </w:rPr>
+      </w:pPr>
+      <w:r>
+        <w:rPr>
+          <w:rStyle w:val="Emphasis"/>
+          <w:b w:val="0"/>
+          <w:iCs w:val="0"/>
+        </w:rPr>
+        <w:t>TIME (local strike time) can be used to derive TIME_OF_DAY (Dawn/Day/Dusk/Night)</w:t>
+      </w:r>
+      <w:r>
+        <w:rPr>
+          <w:rStyle w:val="Emphasis"/>
+          <w:b w:val="0"/>
+          <w:iCs w:val="0"/>
+        </w:rPr>
+        <w:t xml:space="preserve">, although there are approximately ~121,000 missing TIME values as well. </w:t>
       </w:r>
     </w:p>
     <w:p>
@@ -1376,7 +1574,23 @@
           <w:b w:val="0"/>
           <w:iCs w:val="0"/>
         </w:rPr>
-        <w:t xml:space="preserve">INCIDENT_MONTH, YEAR, SPECIES has 0 missing </w:t>
+        <w:t>INCIDENT_MONTH, YEAR, SPECIES has 0 missing</w:t>
+      </w:r>
+      <w:r>
+        <w:rPr>
+          <w:rStyle w:val="Emphasis"/>
+          <w:b w:val="0"/>
+          <w:iCs w:val="0"/>
+        </w:rPr>
+        <w:t>!</w:t>
+      </w:r>
+      <w:r>
+        <w:rPr>
+          <w:rStyle w:val="Emphasis"/>
+          <w:b w:val="0"/>
+          <w:iCs w:val="0"/>
+        </w:rPr>
+        <w:t xml:space="preserve"> </w:t>
       </w:r>
     </w:p>
     <w:p>
@@ -1406,7 +1620,77 @@
           <w:b w:val="0"/>
           <w:iCs w:val="0"/>
         </w:rPr>
-        <w:t xml:space="preserve"> categorized to “Unknown bird – small, medium” totaling up to approximately 130k~ values.</w:t>
+        <w:t xml:space="preserve"> categorized to “Unknown bird – small, medium” totaling up to approximately </w:t>
+      </w:r>
+      <w:r>
+        <w:rPr>
+          <w:rStyle w:val="Emphasis"/>
+          <w:b w:val="0"/>
+          <w:iCs w:val="0"/>
+        </w:rPr>
+        <w:t>~</w:t>
+      </w:r>
+      <w:r>
+        <w:rPr>
+          <w:rStyle w:val="Emphasis"/>
+          <w:b w:val="0"/>
+          <w:iCs w:val="0"/>
+        </w:rPr>
+        <w:t>130</w:t>
+      </w:r>
+      <w:r>
+        <w:rPr>
+          <w:rStyle w:val="Emphasis"/>
+          <w:b w:val="0"/>
+          <w:iCs w:val="0"/>
+        </w:rPr>
+        <w:t>,000</w:t>
+      </w:r>
+      <w:r>
+        <w:rPr>
+          <w:rStyle w:val="Emphasis"/>
+          <w:b w:val="0"/>
+          <w:iCs w:val="0"/>
+        </w:rPr>
+        <w:t>/350</w:t>
+      </w:r>
+      <w:r>
+        <w:rPr>
+          <w:rStyle w:val="Emphasis"/>
+          <w:b w:val="0"/>
+          <w:iCs w:val="0"/>
+        </w:rPr>
+        <w:t>,000</w:t>
+      </w:r>
+      <w:r>
+        <w:rPr>
+          <w:rStyle w:val="Emphasis"/>
+          <w:b w:val="0"/>
+          <w:iCs w:val="0"/>
+        </w:rPr>
+        <w:t>~ values.</w:t>
+      </w:r>
+    </w:p>
+    <w:p>
+      <w:pPr>
+        <w:pStyle w:val="ListBullet"/>
+        <w:numPr>
+          <w:ilvl w:val="2"/>
+          <w:numId w:val="8"/>
+        </w:numPr>
+        <w:rPr>
+          <w:rStyle w:val="Emphasis"/>
+          <w:b w:val="0"/>
+          <w:iCs w:val="0"/>
+        </w:rPr>
+      </w:pPr>
+      <w:r>
+        <w:rPr>
+          <w:rStyle w:val="Emphasis"/>
+          <w:b w:val="0"/>
+          <w:iCs w:val="0"/>
+        </w:rPr>
+        <w:t xml:space="preserve">These will be left as they are. </w:t>
       </w:r>
     </w:p>
     <w:p>
@@ -1428,7 +1712,55 @@
           <w:b w:val="0"/>
           <w:iCs w:val="0"/>
         </w:rPr>
-        <w:t>PHASE_OF_FLIGHT has 138k missing and TIME_OF_DAY has 153k missing values.</w:t>
+        <w:t xml:space="preserve">PHASE_OF_FLIGHT has </w:t>
+      </w:r>
+      <w:r>
+        <w:rPr>
+          <w:rStyle w:val="Emphasis"/>
+          <w:b w:val="0"/>
+          <w:iCs w:val="0"/>
+        </w:rPr>
+        <w:t>~</w:t>
+      </w:r>
+      <w:r>
+        <w:rPr>
+          <w:rStyle w:val="Emphasis"/>
+          <w:b w:val="0"/>
+          <w:iCs w:val="0"/>
+        </w:rPr>
+        <w:t>138</w:t>
+      </w:r>
+      <w:r>
+        <w:rPr>
+          <w:rStyle w:val="Emphasis"/>
+          <w:b w:val="0"/>
+          <w:iCs w:val="0"/>
+        </w:rPr>
+        <w:t>,000</w:t>
+      </w:r>
+      <w:r>
+        <w:rPr>
+          <w:rStyle w:val="Emphasis"/>
+          <w:b w:val="0"/>
+          <w:iCs w:val="0"/>
+        </w:rPr>
+        <w:t>/350</w:t>
+      </w:r>
+      <w:r>
+        <w:rPr>
+          <w:rStyle w:val="Emphasis"/>
+          <w:b w:val="0"/>
+          <w:iCs w:val="0"/>
+        </w:rPr>
+        <w:t>,000</w:t>
+      </w:r>
+      <w:r>
+        <w:rPr>
+          <w:rStyle w:val="Emphasis"/>
+          <w:b w:val="0"/>
+          <w:iCs w:val="0"/>
+        </w:rPr>
+        <w:t xml:space="preserve"> missing</w:t>
       </w:r>
     </w:p>
     <w:p>
@@ -1438,14 +1770,158 @@
           <w:ilvl w:val="1"/>
           <w:numId w:val="8"/>
         </w:numPr>
-      </w:pPr>
-      <w:r>
-        <w:rPr>
-          <w:rStyle w:val="Emphasis"/>
-          <w:b w:val="0"/>
-          <w:iCs w:val="0"/>
-        </w:rPr>
-        <w:t xml:space="preserve">Several other fields have these same issues, but these are the ones that are impacting me the most at the moment. </w:t>
+        <w:rPr>
+          <w:rStyle w:val="Emphasis"/>
+          <w:b w:val="0"/>
+          <w:iCs w:val="0"/>
+        </w:rPr>
+      </w:pPr>
+      <w:r>
+        <w:rPr>
+          <w:rStyle w:val="Emphasis"/>
+          <w:b w:val="0"/>
+          <w:iCs w:val="0"/>
+        </w:rPr>
+        <w:t>Several other fields have these same issues, but these are the ones that are impacting me the most</w:t>
+      </w:r>
+      <w:r>
+        <w:rPr>
+          <w:rStyle w:val="Emphasis"/>
+          <w:b w:val="0"/>
+          <w:iCs w:val="0"/>
+        </w:rPr>
+        <w:t>.</w:t>
+      </w:r>
+      <w:r>
+        <w:rPr>
+          <w:rStyle w:val="Emphasis"/>
+          <w:b w:val="0"/>
+          <w:iCs w:val="0"/>
+        </w:rPr>
+        <w:t xml:space="preserve"> </w:t>
+      </w:r>
+    </w:p>
+    <w:p>
+      <w:pPr>
+        <w:pStyle w:val="ListBullet"/>
+        <w:numPr>
+          <w:ilvl w:val="0"/>
+          <w:numId w:val="8"/>
+        </w:numPr>
+        <w:rPr>
+          <w:rStyle w:val="Emphasis"/>
+          <w:b w:val="0"/>
+          <w:iCs w:val="0"/>
+        </w:rPr>
+      </w:pPr>
+      <w:r>
+        <w:rPr>
+          <w:rStyle w:val="Emphasis"/>
+          <w:b w:val="0"/>
+          <w:iCs w:val="0"/>
+        </w:rPr>
+        <w:t xml:space="preserve">With SPECIES I plan on categorizing them down further into groups such as Water birds, Mammals, and Birds of Prey. </w:t>
+      </w:r>
+    </w:p>
+    <w:p>
+      <w:pPr>
+        <w:pStyle w:val="ListBullet"/>
+        <w:numPr>
+          <w:ilvl w:val="0"/>
+          <w:numId w:val="8"/>
+        </w:numPr>
+        <w:rPr>
+          <w:rStyle w:val="Emphasis"/>
+          <w:b w:val="0"/>
+          <w:iCs w:val="0"/>
+        </w:rPr>
+      </w:pPr>
+      <w:r>
+        <w:rPr>
+          <w:rStyle w:val="Emphasis"/>
+          <w:b w:val="0"/>
+          <w:iCs w:val="0"/>
+        </w:rPr>
+        <w:t>Mapping AIRPORT_ID may be able to give us information on the FAAREGION</w:t>
+      </w:r>
+      <w:r>
+        <w:rPr>
+          <w:rStyle w:val="Emphasis"/>
+          <w:b w:val="0"/>
+          <w:iCs w:val="0"/>
+        </w:rPr>
+        <w:t xml:space="preserve">, each </w:t>
+      </w:r>
+      <w:r>
+        <w:rPr>
+          <w:rStyle w:val="Emphasis"/>
+          <w:b w:val="0"/>
+          <w:iCs w:val="0"/>
+        </w:rPr>
+        <w:t>AIRPORT_ID</w:t>
+      </w:r>
+      <w:r>
+        <w:rPr>
+          <w:rStyle w:val="Emphasis"/>
+          <w:b w:val="0"/>
+          <w:iCs w:val="0"/>
+        </w:rPr>
+        <w:t xml:space="preserve"> should be distinct to </w:t>
+      </w:r>
+      <w:r>
+        <w:rPr>
+          <w:rStyle w:val="Emphasis"/>
+          <w:b w:val="0"/>
+          <w:iCs w:val="0"/>
+        </w:rPr>
+        <w:t>FAAREGION</w:t>
+      </w:r>
+      <w:r>
+        <w:rPr>
+          <w:rStyle w:val="Emphasis"/>
+          <w:b w:val="0"/>
+          <w:iCs w:val="0"/>
+        </w:rPr>
+        <w:t>.</w:t>
+      </w:r>
+    </w:p>
+    <w:p>
+      <w:pPr>
+        <w:pStyle w:val="ListBullet"/>
+        <w:numPr>
+          <w:ilvl w:val="0"/>
+          <w:numId w:val="8"/>
+        </w:numPr>
+        <w:rPr>
+          <w:rStyle w:val="Emphasis"/>
+          <w:b w:val="0"/>
+          <w:iCs w:val="0"/>
+        </w:rPr>
+      </w:pPr>
+      <w:r>
+        <w:rPr>
+          <w:rStyle w:val="Emphasis"/>
+          <w:b w:val="0"/>
+          <w:iCs w:val="0"/>
+        </w:rPr>
+        <w:t>There are HEIGHT and SPEED variables which could potentially give us a PHASE_OF_FLIGHT</w:t>
+      </w:r>
+    </w:p>
+    <w:p>
+      <w:pPr>
+        <w:pStyle w:val="ListBullet"/>
+        <w:numPr>
+          <w:ilvl w:val="0"/>
+          <w:numId w:val="8"/>
+        </w:numPr>
+      </w:pPr>
+      <w:r>
+        <w:rPr>
+          <w:rStyle w:val="Emphasis"/>
+          <w:b w:val="0"/>
+          <w:iCs w:val="0"/>
+        </w:rPr>
+        <w:t>Evaluate imputation versus exclusion strategies</w:t>
       </w:r>
     </w:p>
     <w:p>
@@ -1501,19 +1977,222 @@
         </w:numPr>
       </w:pPr>
       <w:r>
-        <w:t>Start planning on can be done with neural networks/deep learning/logistic regression/</w:t>
-      </w:r>
-      <w:r>
-        <w:t>SVM</w:t>
-      </w:r>
-      <w:r>
-        <w:t xml:space="preserve"> models/rpart </w:t>
-      </w:r>
-      <w:r>
-        <w:t>regarding</w:t>
-      </w:r>
-      <w:r>
-        <w:t xml:space="preserve"> some of my prediction business questions. </w:t>
+        <w:t xml:space="preserve">Start planning and deciding on what prediction model I can </w:t>
+      </w:r>
+      <w:r>
+        <w:t>use</w:t>
+      </w:r>
+      <w:r>
+        <w:t xml:space="preserve"> to help me answer the stated business questions</w:t>
+      </w:r>
+      <w:r>
+        <w:t>.</w:t>
+      </w:r>
+    </w:p>
+    <w:p/>
+    <w:p>
+      <w:pPr>
+        <w:pStyle w:val="Heading2"/>
+      </w:pPr>
+      <w:r>
+        <w:t>Business Questions</w:t>
+      </w:r>
+    </w:p>
+    <w:p>
+      <w:r>
+        <w:t>There are the business questions and columns I’ve identified to be relevant to them. These questions may change or continue to evolve as I explore the dataset.</w:t>
+      </w:r>
+      <w:r>
+        <w:br/>
+      </w:r>
+    </w:p>
+    <w:p>
+      <w:pPr>
+        <w:pStyle w:val="ListParagraph"/>
+        <w:numPr>
+          <w:ilvl w:val="0"/>
+          <w:numId w:val="11"/>
+        </w:numPr>
+        <w:spacing w:before="0" w:after="160" w:line="278" w:lineRule="auto"/>
+        <w:rPr>
+          <w:b/>
+          <w:bCs/>
+        </w:rPr>
+      </w:pPr>
+      <w:r>
+        <w:rPr>
+          <w:b/>
+          <w:bCs/>
+        </w:rPr>
+        <w:t>Do strikes cluster seasonally, and does the seasonal pattern differ by species group or region?</w:t>
+      </w:r>
+      <w:r>
+        <w:rPr>
+          <w:b/>
+          <w:bCs/>
+        </w:rPr>
+        <w:t xml:space="preserve"> </w:t>
+      </w:r>
+      <w:r>
+        <w:rPr>
+          <w:b/>
+          <w:bCs/>
+        </w:rPr>
+        <w:t xml:space="preserve">Relevant variables: </w:t>
+      </w:r>
+      <w:r>
+        <w:t>INCIDENT_MONTH, INCIDENT_YEAR, SPECIES, STATE</w:t>
+      </w:r>
+      <w:r>
+        <w:t>,</w:t>
+      </w:r>
+      <w:r>
+        <w:t xml:space="preserve"> </w:t>
+      </w:r>
+      <w:r>
+        <w:lastRenderedPageBreak/>
+        <w:t>FAAREGION</w:t>
+      </w:r>
+      <w:r>
+        <w:br/>
+      </w:r>
+    </w:p>
+    <w:p>
+      <w:pPr>
+        <w:pStyle w:val="ListParagraph"/>
+        <w:numPr>
+          <w:ilvl w:val="0"/>
+          <w:numId w:val="11"/>
+        </w:numPr>
+        <w:spacing w:before="0" w:after="160" w:line="278" w:lineRule="auto"/>
+        <w:rPr>
+          <w:b/>
+          <w:bCs/>
+        </w:rPr>
+      </w:pPr>
+      <w:r>
+        <w:rPr>
+          <w:b/>
+          <w:bCs/>
+        </w:rPr>
+        <w:t>Can we segment airports into risk profiles based on their strike patterns?</w:t>
+      </w:r>
+      <w:r>
+        <w:rPr>
+          <w:b/>
+          <w:bCs/>
+        </w:rPr>
+        <w:t xml:space="preserve"> </w:t>
+      </w:r>
+      <w:r>
+        <w:rPr>
+          <w:b/>
+          <w:bCs/>
+        </w:rPr>
+        <w:t xml:space="preserve">Relevant variables: </w:t>
+      </w:r>
+      <w:r>
+        <w:t xml:space="preserve">AIRPORT_ID, Strike Total, % damaging Strikes, % occurring at night, Seasonality </w:t>
+      </w:r>
+      <w:r>
+        <w:br/>
+      </w:r>
+    </w:p>
+    <w:p>
+      <w:pPr>
+        <w:pStyle w:val="ListParagraph"/>
+        <w:numPr>
+          <w:ilvl w:val="0"/>
+          <w:numId w:val="11"/>
+        </w:numPr>
+        <w:spacing w:before="0" w:after="160" w:line="278" w:lineRule="auto"/>
+        <w:rPr>
+          <w:b/>
+          <w:bCs/>
+        </w:rPr>
+      </w:pPr>
+      <w:r>
+        <w:rPr>
+          <w:b/>
+          <w:bCs/>
+        </w:rPr>
+        <w:t>Which combination of species, phases of flight, and time of day carry the highest damage risk?</w:t>
+      </w:r>
+      <w:r>
+        <w:rPr>
+          <w:b/>
+          <w:bCs/>
+        </w:rPr>
+        <w:t xml:space="preserve"> </w:t>
+      </w:r>
+      <w:r>
+        <w:rPr>
+          <w:b/>
+          <w:bCs/>
+        </w:rPr>
+        <w:t>Relevant variables:</w:t>
+      </w:r>
+      <w:r>
+        <w:rPr>
+          <w:b/>
+          <w:bCs/>
+        </w:rPr>
+        <w:t xml:space="preserve"> </w:t>
+      </w:r>
+      <w:r>
+        <w:t>SPECIES, SIZE, PHASE_OF_FLIGHT, TIME_OF_DAY, DAMAGE_LEVEL</w:t>
+      </w:r>
+    </w:p>
+    <w:p>
+      <w:pPr>
+        <w:pStyle w:val="ListParagraph"/>
+        <w:spacing w:before="0" w:after="160" w:line="278" w:lineRule="auto"/>
+        <w:ind w:left="2160"/>
+      </w:pPr>
+    </w:p>
+    <w:p>
+      <w:pPr>
+        <w:pStyle w:val="ListParagraph"/>
+        <w:numPr>
+          <w:ilvl w:val="0"/>
+          <w:numId w:val="11"/>
+        </w:numPr>
+        <w:spacing w:before="0" w:after="160" w:line="278" w:lineRule="auto"/>
+        <w:rPr>
+          <w:b/>
+          <w:bCs/>
+        </w:rPr>
+      </w:pPr>
+      <w:r>
+        <w:rPr>
+          <w:b/>
+          <w:bCs/>
+        </w:rPr>
+        <w:t>Given conditions known before or at impact, can we predict whether a strike will cause damage?</w:t>
+      </w:r>
+      <w:r>
+        <w:rPr>
+          <w:b/>
+          <w:bCs/>
+        </w:rPr>
+        <w:t xml:space="preserve"> </w:t>
+      </w:r>
+      <w:r>
+        <w:rPr>
+          <w:b/>
+          <w:bCs/>
+        </w:rPr>
+        <w:t>Relevant variables:</w:t>
+      </w:r>
+      <w:r>
+        <w:rPr>
+          <w:b/>
+          <w:bCs/>
+        </w:rPr>
+        <w:t xml:space="preserve"> </w:t>
+      </w:r>
+      <w:r>
+        <w:t>INDICATED_DAMAGE, SIZE, SPECIES, PHASE_OF_FLIGHT, HEIGHT, SPEED, TIME_OF_DAY, AC_MASS, NUM_ENGS, TYPE_ENG, NUM_STRUC</w:t>
       </w:r>
     </w:p>
     <w:sectPr>
@@ -1571,6 +2250,54 @@
             <w:rStyle w:val="Hyperlink"/>
           </w:rPr>
           <w:t>Aviation Bird Strikes - Precise Flight</w:t>
+        </w:r>
+      </w:hyperlink>
+    </w:p>
+  </w:endnote>
+  <w:endnote w:id="2">
+    <w:p>
+      <w:pPr>
+        <w:pStyle w:val="EndnoteText"/>
+      </w:pPr>
+      <w:r>
+        <w:rPr>
+          <w:rStyle w:val="EndnoteReference"/>
+        </w:rPr>
+        <w:endnoteRef/>
+      </w:r>
+      <w:r>
+        <w:t xml:space="preserve"> Bird Migration timing: </w:t>
+      </w:r>
+      <w:hyperlink r:id="rId2" w:history="1">
+        <w:r>
+          <w:rPr>
+            <w:rStyle w:val="Hyperlink"/>
+          </w:rPr>
+          <w:t>Month-by-Month Guide: When Do Birds Migrate?</w:t>
+        </w:r>
+      </w:hyperlink>
+    </w:p>
+  </w:endnote>
+  <w:endnote w:id="3">
+    <w:p>
+      <w:pPr>
+        <w:pStyle w:val="EndnoteText"/>
+      </w:pPr>
+      <w:r>
+        <w:rPr>
+          <w:rStyle w:val="EndnoteReference"/>
+        </w:rPr>
+        <w:endnoteRef/>
+      </w:r>
+      <w:r>
+        <w:t xml:space="preserve"> Nocturnal Fall migration: </w:t>
+      </w:r>
+      <w:hyperlink r:id="rId3" w:history="1">
+        <w:r>
+          <w:rPr>
+            <w:rStyle w:val="Hyperlink"/>
+          </w:rPr>
+          <w:t>A Massive Bird Migration Is Happening While You Sleep—How to See It</w:t>
         </w:r>
       </w:hyperlink>
     </w:p>
@@ -1936,7 +2663,7 @@
   <w:abstractNum w:abstractNumId="0" w15:restartNumberingAfterBreak="0">
     <w:nsid w:val="FFFFFF89"/>
     <w:multiLevelType w:val="singleLevel"/>
-    <w:tmpl w:val="D788FAB0"/>
+    <w:tmpl w:val="45C8809A"/>
     <w:lvl w:ilvl="0">
       <w:start w:val="1"/>
       <w:numFmt w:val="bullet"/>
@@ -2068,6 +2795,95 @@
     </w:lvl>
   </w:abstractNum>
   <w:abstractNum w:abstractNumId="2" w15:restartNumberingAfterBreak="0">
+    <w:nsid w:val="2BCF523A"/>
+    <w:multiLevelType w:val="hybridMultilevel"/>
+    <w:tmpl w:val="627E18B6"/>
+    <w:lvl w:ilvl="0" w:tplc="0409000B">
+      <w:start w:val="1"/>
+      <w:numFmt w:val="bullet"/>
+      <w:lvlText w:val=""/>
+      <w:lvlJc w:val="left"/>
+      <w:pPr>
+        <w:ind w:left="720" w:hanging="360"/>
+      </w:pPr>
+      <w:rPr>
+        <w:rFonts w:ascii="Wingdings" w:hAnsi="Wingdings" w:hint="default"/>
+      </w:rPr>
+    </w:lvl>
+    <w:lvl w:ilvl="1" w:tplc="FFFFFFFF">
+      <w:start w:val="1"/>
+      <w:numFmt w:val="lowerLetter"/>
+      <w:lvlText w:val="%2."/>
+      <w:lvlJc w:val="left"/>
+      <w:pPr>
+        <w:ind w:left="1440" w:hanging="360"/>
+      </w:pPr>
+    </w:lvl>
+    <w:lvl w:ilvl="2" w:tplc="FFFFFFFF">
+      <w:start w:val="1"/>
+      <w:numFmt w:val="lowerRoman"/>
+      <w:lvlText w:val="%3."/>
+      <w:lvlJc w:val="right"/>
+      <w:pPr>
+        <w:ind w:left="2160" w:hanging="180"/>
+      </w:pPr>
+    </w:lvl>
+    <w:lvl w:ilvl="3" w:tplc="FFFFFFFF" w:tentative="1">
+      <w:start w:val="1"/>
+      <w:numFmt w:val="decimal"/>
+      <w:lvlText w:val="%4."/>
+      <w:lvlJc w:val="left"/>
+      <w:pPr>
+        <w:ind w:left="2880" w:hanging="360"/>
+      </w:pPr>
+    </w:lvl>
+    <w:lvl w:ilvl="4" w:tplc="FFFFFFFF" w:tentative="1">
+      <w:start w:val="1"/>
+      <w:numFmt w:val="lowerLetter"/>
+      <w:lvlText w:val="%5."/>
+      <w:lvlJc w:val="left"/>
+      <w:pPr>
+        <w:ind w:left="3600" w:hanging="360"/>
+      </w:pPr>
+    </w:lvl>
+    <w:lvl w:ilvl="5" w:tplc="FFFFFFFF" w:tentative="1">
+      <w:start w:val="1"/>
+      <w:numFmt w:val="lowerRoman"/>
+      <w:lvlText w:val="%6."/>
+      <w:lvlJc w:val="right"/>
+      <w:pPr>
+        <w:ind w:left="4320" w:hanging="180"/>
+      </w:pPr>
+    </w:lvl>
+    <w:lvl w:ilvl="6" w:tplc="FFFFFFFF" w:tentative="1">
+      <w:start w:val="1"/>
+      <w:numFmt w:val="decimal"/>
+      <w:lvlText w:val="%7."/>
+      <w:lvlJc w:val="left"/>
+      <w:pPr>
+        <w:ind w:left="5040" w:hanging="360"/>
+      </w:pPr>
+    </w:lvl>
+    <w:lvl w:ilvl="7" w:tplc="FFFFFFFF" w:tentative="1">
+      <w:start w:val="1"/>
+      <w:numFmt w:val="lowerLetter"/>
+      <w:lvlText w:val="%8."/>
+      <w:lvlJc w:val="left"/>
+      <w:pPr>
+        <w:ind w:left="5760" w:hanging="360"/>
+      </w:pPr>
+    </w:lvl>
+    <w:lvl w:ilvl="8" w:tplc="FFFFFFFF" w:tentative="1">
+      <w:start w:val="1"/>
+      <w:numFmt w:val="lowerRoman"/>
+      <w:lvlText w:val="%9."/>
+      <w:lvlJc w:val="right"/>
+      <w:pPr>
+        <w:ind w:left="6480" w:hanging="180"/>
+      </w:pPr>
+    </w:lvl>
+  </w:abstractNum>
+  <w:abstractNum w:abstractNumId="3" w15:restartNumberingAfterBreak="0">
     <w:nsid w:val="34DE6223"/>
     <w:multiLevelType w:val="hybridMultilevel"/>
     <w:tmpl w:val="66E82792"/>
@@ -2180,7 +2996,7 @@
       </w:rPr>
     </w:lvl>
   </w:abstractNum>
-  <w:abstractNum w:abstractNumId="3" w15:restartNumberingAfterBreak="0">
+  <w:abstractNum w:abstractNumId="4" w15:restartNumberingAfterBreak="0">
     <w:nsid w:val="3DCC7282"/>
     <w:multiLevelType w:val="hybridMultilevel"/>
     <w:tmpl w:val="702258F6"/>
@@ -2293,7 +3109,7 @@
       </w:rPr>
     </w:lvl>
   </w:abstractNum>
-  <w:abstractNum w:abstractNumId="4" w15:restartNumberingAfterBreak="0">
+  <w:abstractNum w:abstractNumId="5" w15:restartNumberingAfterBreak="0">
     <w:nsid w:val="56FC59DC"/>
     <w:multiLevelType w:val="multilevel"/>
     <w:tmpl w:val="9BD0204E"/>
@@ -2409,7 +3225,7 @@
       </w:pPr>
     </w:lvl>
   </w:abstractNum>
-  <w:abstractNum w:abstractNumId="5" w15:restartNumberingAfterBreak="0">
+  <w:abstractNum w:abstractNumId="6" w15:restartNumberingAfterBreak="0">
     <w:nsid w:val="5AE121CB"/>
     <w:multiLevelType w:val="hybridMultilevel"/>
     <w:tmpl w:val="8F7AD208"/>
@@ -2522,7 +3338,7 @@
       </w:rPr>
     </w:lvl>
   </w:abstractNum>
-  <w:abstractNum w:abstractNumId="6" w15:restartNumberingAfterBreak="0">
+  <w:abstractNum w:abstractNumId="7" w15:restartNumberingAfterBreak="0">
     <w:nsid w:val="5B4667F9"/>
     <w:multiLevelType w:val="hybridMultilevel"/>
     <w:tmpl w:val="1DD008CC"/>
@@ -2635,7 +3451,7 @@
       </w:rPr>
     </w:lvl>
   </w:abstractNum>
-  <w:abstractNum w:abstractNumId="7" w15:restartNumberingAfterBreak="0">
+  <w:abstractNum w:abstractNumId="8" w15:restartNumberingAfterBreak="0">
     <w:nsid w:val="71A47FF6"/>
     <w:multiLevelType w:val="hybridMultilevel"/>
     <w:tmpl w:val="8B7CA9DA"/>
@@ -2748,7 +3564,7 @@
       </w:rPr>
     </w:lvl>
   </w:abstractNum>
-  <w:abstractNum w:abstractNumId="8" w15:restartNumberingAfterBreak="0">
+  <w:abstractNum w:abstractNumId="9" w15:restartNumberingAfterBreak="0">
     <w:nsid w:val="7F1821BB"/>
     <w:multiLevelType w:val="hybridMultilevel"/>
     <w:tmpl w:val="5C1AA75E"/>
@@ -2861,7 +3677,7 @@
       </w:rPr>
     </w:lvl>
   </w:abstractNum>
-  <w:abstractNum w:abstractNumId="9" w15:restartNumberingAfterBreak="0">
+  <w:abstractNum w:abstractNumId="10" w15:restartNumberingAfterBreak="0">
     <w:nsid w:val="7FD01636"/>
     <w:multiLevelType w:val="hybridMultilevel"/>
     <w:tmpl w:val="D54444FC"/>
@@ -2951,7 +3767,7 @@
     </w:lvl>
   </w:abstractNum>
   <w:num w:numId="1" w16cid:durableId="507405310">
-    <w:abstractNumId w:val="4"/>
+    <w:abstractNumId w:val="5"/>
   </w:num>
   <w:num w:numId="2" w16cid:durableId="1276593716">
     <w:abstractNumId w:val="0"/>
@@ -2960,24 +3776,27 @@
     <w:abstractNumId w:val="1"/>
   </w:num>
   <w:num w:numId="4" w16cid:durableId="399838497">
+    <w:abstractNumId w:val="10"/>
+  </w:num>
+  <w:num w:numId="5" w16cid:durableId="1041320083">
+    <w:abstractNumId w:val="8"/>
+  </w:num>
+  <w:num w:numId="6" w16cid:durableId="2045713123">
+    <w:abstractNumId w:val="4"/>
+  </w:num>
+  <w:num w:numId="7" w16cid:durableId="1737123346">
     <w:abstractNumId w:val="9"/>
   </w:num>
-  <w:num w:numId="5" w16cid:durableId="1041320083">
+  <w:num w:numId="8" w16cid:durableId="1998878459">
     <w:abstractNumId w:val="7"/>
   </w:num>
-  <w:num w:numId="6" w16cid:durableId="2045713123">
+  <w:num w:numId="9" w16cid:durableId="687635372">
+    <w:abstractNumId w:val="6"/>
+  </w:num>
+  <w:num w:numId="10" w16cid:durableId="521214107">
     <w:abstractNumId w:val="3"/>
   </w:num>
-  <w:num w:numId="7" w16cid:durableId="1737123346">
-    <w:abstractNumId w:val="8"/>
-  </w:num>
-  <w:num w:numId="8" w16cid:durableId="1998878459">
-    <w:abstractNumId w:val="6"/>
-  </w:num>
-  <w:num w:numId="9" w16cid:durableId="687635372">
-    <w:abstractNumId w:val="5"/>
-  </w:num>
-  <w:num w:numId="10" w16cid:durableId="521214107">
+  <w:num w:numId="11" w16cid:durableId="1156650906">
     <w:abstractNumId w:val="2"/>
   </w:num>
 </w:numbering>
@@ -4428,6 +5247,15 @@
 </file>
 
 <file path=customXml/item1.xml><?xml version="1.0" encoding="utf-8"?>
+<?mso-contentType ?>
+<FormTemplates xmlns="http://schemas.microsoft.com/sharepoint/v3/contenttype/forms">
+  <Display>DocumentLibraryForm</Display>
+  <Edit>DocumentLibraryForm</Edit>
+  <New>DocumentLibraryForm</New>
+</FormTemplates>
+</file>
+
+<file path=customXml/item2.xml><?xml version="1.0" encoding="utf-8"?>
 <ct:contentTypeSchema xmlns:ct="http://schemas.microsoft.com/office/2006/metadata/contentType" xmlns:ma="http://schemas.microsoft.com/office/2006/metadata/properties/metaAttributes" ct:_="" ma:_="" ma:contentTypeName="Document" ma:contentTypeID="0x01010079F111ED35F8CC479449609E8A0923A6" ma:contentTypeVersion="30" ma:contentTypeDescription="Create a new document." ma:contentTypeScope="" ma:versionID="cec0622158e8f13124e9e8fd4de31bd1">
   <xsd:schema xmlns:xsd="http://www.w3.org/2001/XMLSchema" xmlns:xs="http://www.w3.org/2001/XMLSchema" xmlns:p="http://schemas.microsoft.com/office/2006/metadata/properties" xmlns:ns1="http://schemas.microsoft.com/sharepoint/v3" xmlns:ns2="71af3243-3dd4-4a8d-8c0d-dd76da1f02a5" xmlns:ns3="16c05727-aa75-4e4a-9b5f-8a80a1165891" xmlns:ns4="230e9df3-be65-4c73-a93b-d1236ebd677e" targetNamespace="http://schemas.microsoft.com/office/2006/metadata/properties" ma:root="true" ma:fieldsID="3b52f30ab005d15df08657af532e6e38" ns1:_="" ns2:_="" ns3:_="" ns4:_="">
     <xsd:import namespace="http://schemas.microsoft.com/sharepoint/v3"/>
@@ -4745,16 +5573,11 @@
 </ct:contentTypeSchema>
 </file>
 
-<file path=customXml/item2.xml><?xml version="1.0" encoding="utf-8"?>
-<?mso-contentType ?>
-<FormTemplates xmlns="http://schemas.microsoft.com/sharepoint/v3/contenttype/forms">
-  <Display>DocumentLibraryForm</Display>
-  <Edit>DocumentLibraryForm</Edit>
-  <New>DocumentLibraryForm</New>
-</FormTemplates>
+<file path=customXml/item3.xml><?xml version="1.0" encoding="utf-8"?>
+<b:Sources xmlns:b="http://schemas.openxmlformats.org/officeDocument/2006/bibliography" xmlns="http://schemas.openxmlformats.org/officeDocument/2006/bibliography" SelectedStyle="\APASixthEditionOfficeOnline.xsl" StyleName="APA" Version="6"/>
 </file>
 
-<file path=customXml/item3.xml><?xml version="1.0" encoding="utf-8"?>
+<file path=customXml/item4.xml><?xml version="1.0" encoding="utf-8"?>
 <p:properties xmlns:p="http://schemas.microsoft.com/office/2006/metadata/properties" xmlns:xsi="http://www.w3.org/2001/XMLSchema-instance" xmlns:pc="http://schemas.microsoft.com/office/infopath/2007/PartnerControls">
   <documentManagement>
     <_ip_UnifiedCompliancePolicyUIAction xmlns="http://schemas.microsoft.com/sharepoint/v3" xsi:nil="true"/>
@@ -4774,11 +5597,15 @@
 </p:properties>
 </file>
 
-<file path=customXml/item4.xml><?xml version="1.0" encoding="utf-8"?>
-<b:Sources xmlns:b="http://schemas.openxmlformats.org/officeDocument/2006/bibliography" xmlns="http://schemas.openxmlformats.org/officeDocument/2006/bibliography" SelectedStyle="\APASixthEditionOfficeOnline.xsl" StyleName="APA" Version="6"/>
+<file path=customXml/itemProps1.xml><?xml version="1.0" encoding="utf-8"?>
+<ds:datastoreItem xmlns:ds="http://schemas.openxmlformats.org/officeDocument/2006/customXml" ds:itemID="{5FCA0720-E518-4C54-8EC1-2FF547E897F0}">
+  <ds:schemaRefs>
+    <ds:schemaRef ds:uri="http://schemas.microsoft.com/sharepoint/v3/contenttype/forms"/>
+  </ds:schemaRefs>
+</ds:datastoreItem>
 </file>
 
-<file path=customXml/itemProps1.xml><?xml version="1.0" encoding="utf-8"?>
+<file path=customXml/itemProps2.xml><?xml version="1.0" encoding="utf-8"?>
 <ds:datastoreItem xmlns:ds="http://schemas.openxmlformats.org/officeDocument/2006/customXml" ds:itemID="{8AA05782-1956-4ABD-9469-5855286A5A27}">
   <ds:schemaRefs>
     <ds:schemaRef ds:uri="http://schemas.microsoft.com/office/2006/metadata/contentType"/>
@@ -4799,15 +5626,15 @@
 </ds:datastoreItem>
 </file>
 
-<file path=customXml/itemProps2.xml><?xml version="1.0" encoding="utf-8"?>
-<ds:datastoreItem xmlns:ds="http://schemas.openxmlformats.org/officeDocument/2006/customXml" ds:itemID="{5FCA0720-E518-4C54-8EC1-2FF547E897F0}">
+<file path=customXml/itemProps3.xml><?xml version="1.0" encoding="utf-8"?>
+<ds:datastoreItem xmlns:ds="http://schemas.openxmlformats.org/officeDocument/2006/customXml" ds:itemID="{A87DB213-1182-4C1A-8B77-DBF00BD164E1}">
   <ds:schemaRefs>
-    <ds:schemaRef ds:uri="http://schemas.microsoft.com/sharepoint/v3/contenttype/forms"/>
+    <ds:schemaRef ds:uri="http://schemas.openxmlformats.org/officeDocument/2006/bibliography"/>
   </ds:schemaRefs>
 </ds:datastoreItem>
 </file>
 
-<file path=customXml/itemProps3.xml><?xml version="1.0" encoding="utf-8"?>
+<file path=customXml/itemProps4.xml><?xml version="1.0" encoding="utf-8"?>
 <ds:datastoreItem xmlns:ds="http://schemas.openxmlformats.org/officeDocument/2006/customXml" ds:itemID="{27A94286-1488-4B05-BE05-620B873327F0}">
   <ds:schemaRefs>
     <ds:schemaRef ds:uri="http://schemas.microsoft.com/office/2006/metadata/properties"/>
@@ -4819,14 +5646,6 @@
 </ds:datastoreItem>
 </file>
 
-<file path=customXml/itemProps4.xml><?xml version="1.0" encoding="utf-8"?>
-<ds:datastoreItem xmlns:ds="http://schemas.openxmlformats.org/officeDocument/2006/customXml" ds:itemID="{A87DB213-1182-4C1A-8B77-DBF00BD164E1}">
-  <ds:schemaRefs>
-    <ds:schemaRef ds:uri="http://schemas.openxmlformats.org/officeDocument/2006/bibliography"/>
-  </ds:schemaRefs>
-</ds:datastoreItem>
-</file>
-
 <file path=docMetadata/LabelInfo.xml><?xml version="1.0" encoding="utf-8"?>
 <clbl:labelList xmlns:clbl="http://schemas.microsoft.com/office/2020/mipLabelMetadata"/>
 </file>
</xml_diff>